<commit_message>
fix: preencher empresa no modelo NR35
</commit_message>
<xml_diff>
--- a/cursos/NR 35.docx
+++ b/cursos/NR 35.docx
@@ -205,7 +205,26 @@
           <w:sz w:val="32"/>
           <w:szCs w:val="32"/>
         </w:rPr>
-        <w:t xml:space="preserve">por ter submetido e aprovado em treinamento, teórico e prático para Trabalho em Altura pela Empresa Otten Engenharia, em conformidade com a NR  35, com carga horária de </w:t>
+        <w:t xml:space="preserve">por ter submetido e aprovado em treinamento, teórico e prático para Trabalho em Altura pela Empresa </w:t>
+      </w:r>
+      <w:r>
+        <w:rPr>
+          <w:rFonts w:hint="default" w:ascii="Arial" w:hAnsi="Arial" w:eastAsia="Corsiva" w:cs="Arial"/>
+          <w:sz w:val="32"/>
+          <w:szCs w:val="32"/>
+          <w:lang w:val="pt-BR"/>
+        </w:rPr>
+        <w:t>{{EMPRESA}}</w:t>
+      </w:r>
+      <w:bookmarkStart w:id="0" w:name="_GoBack"/>
+      <w:bookmarkEnd w:id="0"/>
+      <w:r>
+        <w:rPr>
+          <w:rFonts w:ascii="Arial" w:hAnsi="Arial" w:eastAsia="Corsiva" w:cs="Arial"/>
+          <w:sz w:val="32"/>
+          <w:szCs w:val="32"/>
+        </w:rPr>
+        <w:t xml:space="preserve">, em conformidade com a NR  35, com carga horária de </w:t>
       </w:r>
       <w:r>
         <w:rPr>
@@ -740,7 +759,6 @@
           <w:lang w:val="pt-BR"/>
         </w:rPr>
         <w:tab/>
-        <w:t/>
       </w:r>
       <w:r>
         <w:rPr>
@@ -750,7 +768,6 @@
           <w:lang w:val="pt-BR"/>
         </w:rPr>
         <w:tab/>
-        <w:t/>
       </w:r>
       <w:r>
         <w:rPr>
@@ -760,7 +777,6 @@
           <w:lang w:val="pt-BR"/>
         </w:rPr>
         <w:tab/>
-        <w:t/>
       </w:r>
       <w:r>
         <w:rPr>
@@ -788,8 +804,6 @@
         </w:rPr>
         <w:t xml:space="preserve"> Numeração {{COD}}</w:t>
       </w:r>
-      <w:bookmarkStart w:id="0" w:name="_GoBack"/>
-      <w:bookmarkEnd w:id="0"/>
     </w:p>
     <w:sectPr>
       <w:headerReference r:id="rId7" w:type="first"/>
@@ -1127,7 +1141,7 @@
     <w:lsdException w:uiPriority="99" w:name="footnote text"/>
     <w:lsdException w:uiPriority="99" w:name="annotation text"/>
     <w:lsdException w:uiPriority="99" w:name="header"/>
-    <w:lsdException w:uiPriority="99" w:semiHidden="0" w:name="footer"/>
+    <w:lsdException w:qFormat="1" w:uiPriority="99" w:semiHidden="0" w:name="footer"/>
     <w:lsdException w:uiPriority="99" w:name="index heading"/>
     <w:lsdException w:qFormat="1" w:uiPriority="35" w:name="caption"/>
     <w:lsdException w:uiPriority="99" w:name="table of figures"/>
@@ -1160,7 +1174,7 @@
     <w:lsdException w:qFormat="1" w:unhideWhenUsed="0" w:uiPriority="10" w:semiHidden="0" w:name="Title"/>
     <w:lsdException w:uiPriority="99" w:name="Closing"/>
     <w:lsdException w:uiPriority="99" w:name="Signature"/>
-    <w:lsdException w:uiPriority="1" w:name="Default Paragraph Font"/>
+    <w:lsdException w:qFormat="1" w:uiPriority="1" w:name="Default Paragraph Font"/>
     <w:lsdException w:uiPriority="99" w:name="Body Text"/>
     <w:lsdException w:uiPriority="99" w:name="Body Text Indent"/>
     <w:lsdException w:uiPriority="99" w:name="List Continue"/>
@@ -1381,6 +1395,7 @@
     <w:name w:val="Default Paragraph Font"/>
     <w:semiHidden/>
     <w:unhideWhenUsed/>
+    <w:qFormat/>
     <w:uiPriority w:val="1"/>
   </w:style>
   <w:style w:type="table" w:default="1" w:styleId="9">
@@ -1420,6 +1435,7 @@
     <w:basedOn w:val="1"/>
     <w:link w:val="17"/>
     <w:unhideWhenUsed/>
+    <w:qFormat/>
     <w:uiPriority w:val="99"/>
     <w:pPr>
       <w:tabs>
@@ -1481,6 +1497,7 @@
   <w:style w:type="table" w:customStyle="1" w:styleId="15">
     <w:name w:val="_Style 12"/>
     <w:basedOn w:val="14"/>
+    <w:qFormat/>
     <w:uiPriority w:val="0"/>
     <w:tblPr>
       <w:tblCellMar>
@@ -1496,6 +1513,7 @@
     <w:basedOn w:val="8"/>
     <w:link w:val="12"/>
     <w:semiHidden/>
+    <w:qFormat/>
     <w:uiPriority w:val="99"/>
     <w:rPr>
       <w:rFonts w:ascii="Segoe UI" w:hAnsi="Segoe UI" w:eastAsia="Calibri" w:cs="Segoe UI"/>
@@ -1507,6 +1525,7 @@
     <w:name w:val="Rodapé Char"/>
     <w:basedOn w:val="8"/>
     <w:link w:val="11"/>
+    <w:qFormat/>
     <w:uiPriority w:val="99"/>
     <w:rPr>
       <w:rFonts w:ascii="Calibri" w:hAnsi="Calibri" w:eastAsia="Calibri" w:cs="Calibri"/>

</xml_diff>